<commit_message>
docs: update rapport, ERD, migrations replayability and dashboard fixes
</commit_message>
<xml_diff>
--- a/alumni_crm_api/docs/erd_alumni_crm.docx
+++ b/alumni_crm_api/docs/erd_alumni_crm.docx
@@ -8,27 +8,28 @@
         <w:jc w:val="center"/>
       </w:pPr>
       <w:r>
-        <w:t>Modèle Conceptuel et Logique de Données — CRM Alumni</w:t>
+        <w:t>Modele Conceptuel et Logique de Donnees - CRM Alumni</w:t>
       </w:r>
     </w:p>
     <w:p>
-      <w:pPr>
-        <w:jc w:val="center"/>
-      </w:pPr>
       <w:r>
-        <w:t>Base de données PostgreSQL : alumni_crm (schéma public)</w:t>
+        <w:t>Base de donnees PostgreSQL : alumni_crm (schema public)</w:t>
         <w:br/>
-      </w:r>
-      <w:r>
-        <w:t>14 tables — 12 tables métier + otp_codes + schema_migrations</w:t>
+        <w:t>14 tables : 12 tables metier + otp_codes + schema_migrations</w:t>
         <w:br/>
-      </w:r>
-      <w:r>
-        <w:t>Généré le 10/08/2026 depuis l'introspection de la base réelle</w:t>
+        <w:t>Genere le 10/08/2026 depuis l introspection de la base reelle</w:t>
         <w:br/>
-      </w:r>
-      <w:r>
-        <w:t>Vérifié et corrigé le 15/08/2026 contre le schéma réel (migrations jusqu'à 010_email_academique_unique.sql) : DEMANDE_RGPD complétée (009) et CONSENTEMENT_RGPD enrichi (006). Mis à jour le 22/08/2026 : renumérotation continue des migrations (001→012), ajout de EXPERIENCE_PRO.salary_annuel (012) et confirmation du ON DELETE CASCADE sur REPONSE_QUESTIONNAIRE.id_etudiant (011).</w:t>
+        <w:t>Verifie et corrige le 15/08/2026 contre le schema reel (migrations jusqu a 010).</w:t>
+        <w:br/>
+        <w:t>Mis a jour le 25/08/2026 : migrations 000-014 (15 fichiers),</w:t>
+        <w:br/>
+        <w:t xml:space="preserve">  011 : REPONSE_QUESTIONNAIRE.id_etudiant ON DELETE CASCADE</w:t>
+        <w:br/>
+        <w:t xml:space="preserve">  012 : EXPERIENCE_PRO.salary_annuel NUMERIC(10,2) DEFAULT 0</w:t>
+        <w:br/>
+        <w:t xml:space="preserve">  013 : OTP_CODES formalisee</w:t>
+        <w:br/>
+        <w:t xml:space="preserve">  014 : QUESTIONNAIRE.actif BOOLEAN DEFAULT TRUE</w:t>
       </w:r>
     </w:p>
     <w:p>
@@ -36,7 +37,7 @@
         <w:pStyle w:val="Heading1"/>
       </w:pPr>
       <w:r>
-        <w:t>1. Relations entre entités</w:t>
+        <w:t>1. Relations entre entites</w:t>
       </w:r>
     </w:p>
     <w:tbl>
@@ -58,36 +59,27 @@
           </w:tcPr>
           <w:p>
             <w:r>
-              <w:rPr>
-                <w:b/>
-              </w:rPr>
-              <w:t>Entité source</w:t>
-            </w:r>
-          </w:p>
-        </w:tc>
-        <w:tc>
-          <w:tcPr>
-            <w:tcW w:type="dxa" w:w="2880"/>
-          </w:tcPr>
-          <w:p>
-            <w:r>
-              <w:rPr>
-                <w:b/>
-              </w:rPr>
-              <w:t>Entité cible</w:t>
-            </w:r>
-          </w:p>
-        </w:tc>
-        <w:tc>
-          <w:tcPr>
-            <w:tcW w:type="dxa" w:w="2880"/>
-          </w:tcPr>
-          <w:p>
-            <w:r>
-              <w:rPr>
-                <w:b/>
-              </w:rPr>
-              <w:t>Cardinalité (source -&gt; cible) / libellé</w:t>
+              <w:t>Entite source</w:t>
+            </w:r>
+          </w:p>
+        </w:tc>
+        <w:tc>
+          <w:tcPr>
+            <w:tcW w:type="dxa" w:w="2880"/>
+          </w:tcPr>
+          <w:p>
+            <w:r>
+              <w:t>Entite cible</w:t>
+            </w:r>
+          </w:p>
+        </w:tc>
+        <w:tc>
+          <w:tcPr>
+            <w:tcW w:type="dxa" w:w="2880"/>
+          </w:tcPr>
+          <w:p>
+            <w:r>
+              <w:t>Cardinalite</w:t>
             </w:r>
           </w:p>
         </w:tc>
@@ -215,7 +207,7 @@
           </w:tcPr>
           <w:p>
             <w:r>
-              <w:t>1-N : obtient (jonction N-N avec CERTIFICATION)</w:t>
+              <w:t>1-N : obtient (jonction N-N)</w:t>
             </w:r>
           </w:p>
         </w:tc>
@@ -247,7 +239,7 @@
           </w:tcPr>
           <w:p>
             <w:r>
-              <w:t>1-N : est obtenue par (jonction N-N avec ETUDIANT)</w:t>
+              <w:t>1-N : est obtenue par (jonction N-N)</w:t>
             </w:r>
           </w:p>
         </w:tc>
@@ -407,13 +399,17 @@
           </w:tcPr>
           <w:p>
             <w:r>
-              <w:t>0..1-N : emet (FK nullable, ON DELETE SET NULL)</w:t>
+              <w:t>0-N : emet (SET NULL)</w:t>
             </w:r>
           </w:p>
         </w:tc>
       </w:tr>
     </w:tbl>
-    <w:p/>
+    <w:p>
+      <w:r>
+        <w:br w:type="page"/>
+      </w:r>
+    </w:p>
     <w:p>
       <w:pPr>
         <w:pStyle w:val="Heading1"/>
@@ -434,6 +430,7 @@
       <w:tblPr>
         <w:tblStyle w:val="LightGrid-Accent1"/>
         <w:tblW w:type="auto" w:w="0"/>
+        <w:jc w:val="center"/>
         <w:tblLook w:firstColumn="1" w:firstRow="1" w:lastColumn="0" w:lastRow="0" w:noHBand="0" w:noVBand="1" w:val="04A0"/>
       </w:tblPr>
       <w:tblGrid>
@@ -448,9 +445,6 @@
           </w:tcPr>
           <w:p>
             <w:r>
-              <w:rPr>
-                <w:b/>
-              </w:rPr>
               <w:t>Champ</w:t>
             </w:r>
           </w:p>
@@ -461,9 +455,6 @@
           </w:tcPr>
           <w:p>
             <w:r>
-              <w:rPr>
-                <w:b/>
-              </w:rPr>
               <w:t>Type</w:t>
             </w:r>
           </w:p>
@@ -474,9 +465,6 @@
           </w:tcPr>
           <w:p>
             <w:r>
-              <w:rPr>
-                <w:b/>
-              </w:rPr>
               <w:t>Contraintes / description</w:t>
             </w:r>
           </w:p>
@@ -509,7 +497,7 @@
           </w:tcPr>
           <w:p>
             <w:r>
-              <w:t>PK "SERIAL"</w:t>
+              <w:t>PK SERIAL</w:t>
             </w:r>
           </w:p>
         </w:tc>
@@ -541,7 +529,7 @@
           </w:tcPr>
           <w:p>
             <w:r>
-              <w:t>"NOT NULL"</w:t>
+              <w:t>NOT NULL</w:t>
             </w:r>
           </w:p>
         </w:tc>
@@ -573,7 +561,7 @@
           </w:tcPr>
           <w:p>
             <w:r>
-              <w:t>"NOT NULL"</w:t>
+              <w:t>NOT NULL</w:t>
             </w:r>
           </w:p>
         </w:tc>
@@ -605,7 +593,7 @@
           </w:tcPr>
           <w:p>
             <w:r>
-              <w:t>"NOT NULL"</w:t>
+              <w:t>NOT NULL</w:t>
             </w:r>
           </w:p>
         </w:tc>
@@ -624,6 +612,7 @@
       <w:tblPr>
         <w:tblStyle w:val="LightGrid-Accent1"/>
         <w:tblW w:type="auto" w:w="0"/>
+        <w:jc w:val="center"/>
         <w:tblLook w:firstColumn="1" w:firstRow="1" w:lastColumn="0" w:lastRow="0" w:noHBand="0" w:noVBand="1" w:val="04A0"/>
       </w:tblPr>
       <w:tblGrid>
@@ -638,9 +627,6 @@
           </w:tcPr>
           <w:p>
             <w:r>
-              <w:rPr>
-                <w:b/>
-              </w:rPr>
               <w:t>Champ</w:t>
             </w:r>
           </w:p>
@@ -651,9 +637,6 @@
           </w:tcPr>
           <w:p>
             <w:r>
-              <w:rPr>
-                <w:b/>
-              </w:rPr>
               <w:t>Type</w:t>
             </w:r>
           </w:p>
@@ -664,9 +647,6 @@
           </w:tcPr>
           <w:p>
             <w:r>
-              <w:rPr>
-                <w:b/>
-              </w:rPr>
               <w:t>Contraintes / description</w:t>
             </w:r>
           </w:p>
@@ -699,7 +679,7 @@
           </w:tcPr>
           <w:p>
             <w:r>
-              <w:t>PK "SERIAL"</w:t>
+              <w:t>PK SERIAL</w:t>
             </w:r>
           </w:p>
         </w:tc>
@@ -731,7 +711,7 @@
           </w:tcPr>
           <w:p>
             <w:r>
-              <w:t>"NOT NULL"</w:t>
+              <w:t>NOT NULL</w:t>
             </w:r>
           </w:p>
         </w:tc>
@@ -763,7 +743,7 @@
           </w:tcPr>
           <w:p>
             <w:r>
-              <w:t>"NOT NULL"</w:t>
+              <w:t>NOT NULL</w:t>
             </w:r>
           </w:p>
         </w:tc>
@@ -795,7 +775,7 @@
           </w:tcPr>
           <w:p>
             <w:r>
-              <w:t>"NOT NULL, UNIQUE"</w:t>
+              <w:t>NOT NULL, UNIQUE</w:t>
             </w:r>
           </w:p>
         </w:tc>
@@ -859,7 +839,7 @@
           </w:tcPr>
           <w:p>
             <w:r>
-              <w:t>"NOT NULL"</w:t>
+              <w:t>NOT NULL</w:t>
             </w:r>
           </w:p>
         </w:tc>
@@ -891,7 +871,7 @@
           </w:tcPr>
           <w:p>
             <w:r>
-              <w:t>"NOT NULL"</w:t>
+              <w:t>NOT NULL</w:t>
             </w:r>
           </w:p>
         </w:tc>
@@ -923,7 +903,7 @@
           </w:tcPr>
           <w:p>
             <w:r>
-              <w:t>"NOT NULL"</w:t>
+              <w:t>NOT NULL</w:t>
             </w:r>
           </w:p>
         </w:tc>
@@ -955,7 +935,7 @@
           </w:tcPr>
           <w:p>
             <w:r>
-              <w:t>"NOT NULL"</w:t>
+              <w:t>NOT NULL</w:t>
             </w:r>
           </w:p>
         </w:tc>
@@ -987,7 +967,7 @@
           </w:tcPr>
           <w:p>
             <w:r>
-              <w:t>FK "NOT NULL, ON DELETE CASCADE"</w:t>
+              <w:t>FK NOT NULL, ON DELETE CASCADE</w:t>
             </w:r>
           </w:p>
         </w:tc>
@@ -1019,7 +999,7 @@
           </w:tcPr>
           <w:p>
             <w:r>
-              <w:t>"DEFAULT ''"</w:t>
+              <w:t>DEFAULT empty string</w:t>
             </w:r>
           </w:p>
         </w:tc>
@@ -1051,7 +1031,7 @@
           </w:tcPr>
           <w:p>
             <w:r>
-              <w:t>"DEFAULT ''"</w:t>
+              <w:t>DEFAULT empty string</w:t>
             </w:r>
           </w:p>
         </w:tc>
@@ -1083,7 +1063,7 @@
           </w:tcPr>
           <w:p>
             <w:r>
-              <w:t>"DEFAULT ''"</w:t>
+              <w:t>DEFAULT empty string</w:t>
             </w:r>
           </w:p>
         </w:tc>
@@ -1115,7 +1095,7 @@
           </w:tcPr>
           <w:p>
             <w:r>
-              <w:t>"DEFAULT ''"</w:t>
+              <w:t>DEFAULT empty string</w:t>
             </w:r>
           </w:p>
         </w:tc>
@@ -1147,7 +1127,7 @@
           </w:tcPr>
           <w:p>
             <w:r>
-              <w:t>"en_poste | a_lecoute | en_recherche"</w:t>
+              <w:t>en_poste | a_lecoute | en_recherche</w:t>
             </w:r>
           </w:p>
         </w:tc>
@@ -1179,7 +1159,7 @@
           </w:tcPr>
           <w:p>
             <w:r>
-              <w:t>"DEFAULT '[]'"</w:t>
+              <w:t>DEFAULT []</w:t>
             </w:r>
           </w:p>
         </w:tc>
@@ -1211,7 +1191,7 @@
           </w:tcPr>
           <w:p>
             <w:r>
-              <w:t>"RGPD, NULL si actif"</w:t>
+              <w:t>RGPD, NULL si actif</w:t>
             </w:r>
           </w:p>
         </w:tc>
@@ -1230,6 +1210,7 @@
       <w:tblPr>
         <w:tblStyle w:val="LightGrid-Accent1"/>
         <w:tblW w:type="auto" w:w="0"/>
+        <w:jc w:val="center"/>
         <w:tblLook w:firstColumn="1" w:firstRow="1" w:lastColumn="0" w:lastRow="0" w:noHBand="0" w:noVBand="1" w:val="04A0"/>
       </w:tblPr>
       <w:tblGrid>
@@ -1244,9 +1225,6 @@
           </w:tcPr>
           <w:p>
             <w:r>
-              <w:rPr>
-                <w:b/>
-              </w:rPr>
               <w:t>Champ</w:t>
             </w:r>
           </w:p>
@@ -1257,9 +1235,6 @@
           </w:tcPr>
           <w:p>
             <w:r>
-              <w:rPr>
-                <w:b/>
-              </w:rPr>
               <w:t>Type</w:t>
             </w:r>
           </w:p>
@@ -1270,9 +1245,6 @@
           </w:tcPr>
           <w:p>
             <w:r>
-              <w:rPr>
-                <w:b/>
-              </w:rPr>
               <w:t>Contraintes / description</w:t>
             </w:r>
           </w:p>
@@ -1305,7 +1277,7 @@
           </w:tcPr>
           <w:p>
             <w:r>
-              <w:t>PK "SERIAL"</w:t>
+              <w:t>PK SERIAL</w:t>
             </w:r>
           </w:p>
         </w:tc>
@@ -1337,7 +1309,7 @@
           </w:tcPr>
           <w:p>
             <w:r>
-              <w:t>"NOT NULL"</w:t>
+              <w:t>NOT NULL</w:t>
             </w:r>
           </w:p>
         </w:tc>
@@ -1369,7 +1341,7 @@
           </w:tcPr>
           <w:p>
             <w:r>
-              <w:t>"NOT NULL"</w:t>
+              <w:t>NOT NULL</w:t>
             </w:r>
           </w:p>
         </w:tc>
@@ -1401,7 +1373,7 @@
           </w:tcPr>
           <w:p>
             <w:r>
-              <w:t>"NOT NULL"</w:t>
+              <w:t>NOT NULL</w:t>
             </w:r>
           </w:p>
         </w:tc>
@@ -1433,7 +1405,7 @@
           </w:tcPr>
           <w:p>
             <w:r>
-              <w:t>"NOT NULL"</w:t>
+              <w:t>NOT NULL</w:t>
             </w:r>
           </w:p>
         </w:tc>
@@ -1452,6 +1424,7 @@
       <w:tblPr>
         <w:tblStyle w:val="LightGrid-Accent1"/>
         <w:tblW w:type="auto" w:w="0"/>
+        <w:jc w:val="center"/>
         <w:tblLook w:firstColumn="1" w:firstRow="1" w:lastColumn="0" w:lastRow="0" w:noHBand="0" w:noVBand="1" w:val="04A0"/>
       </w:tblPr>
       <w:tblGrid>
@@ -1466,9 +1439,6 @@
           </w:tcPr>
           <w:p>
             <w:r>
-              <w:rPr>
-                <w:b/>
-              </w:rPr>
               <w:t>Champ</w:t>
             </w:r>
           </w:p>
@@ -1479,9 +1449,6 @@
           </w:tcPr>
           <w:p>
             <w:r>
-              <w:rPr>
-                <w:b/>
-              </w:rPr>
               <w:t>Type</w:t>
             </w:r>
           </w:p>
@@ -1492,9 +1459,6 @@
           </w:tcPr>
           <w:p>
             <w:r>
-              <w:rPr>
-                <w:b/>
-              </w:rPr>
               <w:t>Contraintes / description</w:t>
             </w:r>
           </w:p>
@@ -1527,7 +1491,7 @@
           </w:tcPr>
           <w:p>
             <w:r>
-              <w:t>PK "SERIAL"</w:t>
+              <w:t>PK SERIAL</w:t>
             </w:r>
           </w:p>
         </w:tc>
@@ -1559,7 +1523,7 @@
           </w:tcPr>
           <w:p>
             <w:r>
-              <w:t>FK "NOT NULL, ON DELETE CASCADE"</w:t>
+              <w:t>FK NOT NULL, ON DELETE CASCADE</w:t>
             </w:r>
           </w:p>
         </w:tc>
@@ -1591,7 +1555,7 @@
           </w:tcPr>
           <w:p>
             <w:r>
-              <w:t>FK "NOT NULL, ON DELETE CASCADE"</w:t>
+              <w:t>FK NOT NULL, ON DELETE CASCADE</w:t>
             </w:r>
           </w:p>
         </w:tc>
@@ -1623,7 +1587,7 @@
           </w:tcPr>
           <w:p>
             <w:r>
-              <w:t>"NOT NULL"</w:t>
+              <w:t>NOT NULL</w:t>
             </w:r>
           </w:p>
         </w:tc>
@@ -1655,7 +1619,7 @@
           </w:tcPr>
           <w:p>
             <w:r>
-              <w:t>"NOT NULL"</w:t>
+              <w:t>NOT NULL</w:t>
             </w:r>
           </w:p>
         </w:tc>
@@ -1687,7 +1651,7 @@
           </w:tcPr>
           <w:p>
             <w:r>
-              <w:t>"NOT NULL"</w:t>
+              <w:t>NOT NULL</w:t>
             </w:r>
           </w:p>
         </w:tc>
@@ -1719,7 +1683,7 @@
           </w:tcPr>
           <w:p>
             <w:r>
-              <w:t>"NULL si poste actuel"</w:t>
+              <w:t>NULL si poste actuel</w:t>
             </w:r>
           </w:p>
         </w:tc>
@@ -1751,7 +1715,7 @@
           </w:tcPr>
           <w:p>
             <w:r>
-              <w:t>"NOT NULL, salaire mensuel"</w:t>
+              <w:t>NOT NULL, salaire mensuel</w:t>
             </w:r>
           </w:p>
         </w:tc>
@@ -1783,7 +1747,7 @@
           </w:tcPr>
           <w:p>
             <w:r>
-              <w:t>"DEFAULT 0, salaire annuel (migration 012)"</w:t>
+              <w:t>DEFAULT 0, salaire annuel (migration 012)</w:t>
             </w:r>
           </w:p>
         </w:tc>
@@ -1815,7 +1779,7 @@
           </w:tcPr>
           <w:p>
             <w:r>
-              <w:t>"DEFAULT true"</w:t>
+              <w:t>DEFAULT true</w:t>
             </w:r>
           </w:p>
         </w:tc>
@@ -1834,6 +1798,7 @@
       <w:tblPr>
         <w:tblStyle w:val="LightGrid-Accent1"/>
         <w:tblW w:type="auto" w:w="0"/>
+        <w:jc w:val="center"/>
         <w:tblLook w:firstColumn="1" w:firstRow="1" w:lastColumn="0" w:lastRow="0" w:noHBand="0" w:noVBand="1" w:val="04A0"/>
       </w:tblPr>
       <w:tblGrid>
@@ -1848,9 +1813,6 @@
           </w:tcPr>
           <w:p>
             <w:r>
-              <w:rPr>
-                <w:b/>
-              </w:rPr>
               <w:t>Champ</w:t>
             </w:r>
           </w:p>
@@ -1861,9 +1823,6 @@
           </w:tcPr>
           <w:p>
             <w:r>
-              <w:rPr>
-                <w:b/>
-              </w:rPr>
               <w:t>Type</w:t>
             </w:r>
           </w:p>
@@ -1874,9 +1833,6 @@
           </w:tcPr>
           <w:p>
             <w:r>
-              <w:rPr>
-                <w:b/>
-              </w:rPr>
               <w:t>Contraintes / description</w:t>
             </w:r>
           </w:p>
@@ -1909,7 +1865,7 @@
           </w:tcPr>
           <w:p>
             <w:r>
-              <w:t>PK "SERIAL"</w:t>
+              <w:t>PK SERIAL</w:t>
             </w:r>
           </w:p>
         </w:tc>
@@ -1941,7 +1897,7 @@
           </w:tcPr>
           <w:p>
             <w:r>
-              <w:t>"NOT NULL"</w:t>
+              <w:t>NOT NULL</w:t>
             </w:r>
           </w:p>
         </w:tc>
@@ -1973,7 +1929,7 @@
           </w:tcPr>
           <w:p>
             <w:r>
-              <w:t>"NOT NULL"</w:t>
+              <w:t>NOT NULL</w:t>
             </w:r>
           </w:p>
         </w:tc>
@@ -1992,6 +1948,7 @@
       <w:tblPr>
         <w:tblStyle w:val="LightGrid-Accent1"/>
         <w:tblW w:type="auto" w:w="0"/>
+        <w:jc w:val="center"/>
         <w:tblLook w:firstColumn="1" w:firstRow="1" w:lastColumn="0" w:lastRow="0" w:noHBand="0" w:noVBand="1" w:val="04A0"/>
       </w:tblPr>
       <w:tblGrid>
@@ -2006,9 +1963,6 @@
           </w:tcPr>
           <w:p>
             <w:r>
-              <w:rPr>
-                <w:b/>
-              </w:rPr>
               <w:t>Champ</w:t>
             </w:r>
           </w:p>
@@ -2019,9 +1973,6 @@
           </w:tcPr>
           <w:p>
             <w:r>
-              <w:rPr>
-                <w:b/>
-              </w:rPr>
               <w:t>Type</w:t>
             </w:r>
           </w:p>
@@ -2032,9 +1983,6 @@
           </w:tcPr>
           <w:p>
             <w:r>
-              <w:rPr>
-                <w:b/>
-              </w:rPr>
               <w:t>Contraintes / description</w:t>
             </w:r>
           </w:p>
@@ -2067,7 +2015,7 @@
           </w:tcPr>
           <w:p>
             <w:r>
-              <w:t>PK, FK "table de jonction N-N"</w:t>
+              <w:t>PK, FK table de jonction N-N</w:t>
             </w:r>
           </w:p>
         </w:tc>
@@ -2099,7 +2047,7 @@
           </w:tcPr>
           <w:p>
             <w:r>
-              <w:t>PK, FK "table de jonction N-N"</w:t>
+              <w:t>PK, FK table de jonction N-N</w:t>
             </w:r>
           </w:p>
         </w:tc>
@@ -2131,7 +2079,7 @@
           </w:tcPr>
           <w:p>
             <w:r>
-              <w:t>"NOT NULL"</w:t>
+              <w:t>NOT NULL</w:t>
             </w:r>
           </w:p>
         </w:tc>
@@ -2150,6 +2098,7 @@
       <w:tblPr>
         <w:tblStyle w:val="LightGrid-Accent1"/>
         <w:tblW w:type="auto" w:w="0"/>
+        <w:jc w:val="center"/>
         <w:tblLook w:firstColumn="1" w:firstRow="1" w:lastColumn="0" w:lastRow="0" w:noHBand="0" w:noVBand="1" w:val="04A0"/>
       </w:tblPr>
       <w:tblGrid>
@@ -2164,9 +2113,6 @@
           </w:tcPr>
           <w:p>
             <w:r>
-              <w:rPr>
-                <w:b/>
-              </w:rPr>
               <w:t>Champ</w:t>
             </w:r>
           </w:p>
@@ -2177,9 +2123,6 @@
           </w:tcPr>
           <w:p>
             <w:r>
-              <w:rPr>
-                <w:b/>
-              </w:rPr>
               <w:t>Type</w:t>
             </w:r>
           </w:p>
@@ -2190,9 +2133,6 @@
           </w:tcPr>
           <w:p>
             <w:r>
-              <w:rPr>
-                <w:b/>
-              </w:rPr>
               <w:t>Contraintes / description</w:t>
             </w:r>
           </w:p>
@@ -2225,7 +2165,7 @@
           </w:tcPr>
           <w:p>
             <w:r>
-              <w:t>PK "SERIAL"</w:t>
+              <w:t>PK SERIAL</w:t>
             </w:r>
           </w:p>
         </w:tc>
@@ -2257,7 +2197,7 @@
           </w:tcPr>
           <w:p>
             <w:r>
-              <w:t>FK "NOT NULL, ON DELETE CASCADE"</w:t>
+              <w:t>FK NOT NULL, ON DELETE CASCADE</w:t>
             </w:r>
           </w:p>
         </w:tc>
@@ -2289,7 +2229,7 @@
           </w:tcPr>
           <w:p>
             <w:r>
-              <w:t>"NOT NULL"</w:t>
+              <w:t>NOT NULL</w:t>
             </w:r>
           </w:p>
         </w:tc>
@@ -2321,7 +2261,7 @@
           </w:tcPr>
           <w:p>
             <w:r>
-              <w:t>NOT NULL, ex: PROFIL_ALUMNI — UNIQUE composite (id_etudiant, type_consentement)</w:t>
+              <w:t>NOT NULL, UNIQUE (id_etudiant, type_consentement)</w:t>
             </w:r>
           </w:p>
         </w:tc>
@@ -2353,7 +2293,7 @@
           </w:tcPr>
           <w:p>
             <w:r>
-              <w:t>"NOT NULL, ACCORD | REFUS"</w:t>
+              <w:t>NOT NULL, ACCORD | REFUS</w:t>
             </w:r>
           </w:p>
         </w:tc>
@@ -2385,7 +2325,7 @@
           </w:tcPr>
           <w:p>
             <w:r>
-              <w:t>"NOT NULL"</w:t>
+              <w:t>NOT NULL</w:t>
             </w:r>
           </w:p>
         </w:tc>
@@ -2404,6 +2344,7 @@
       <w:tblPr>
         <w:tblStyle w:val="LightGrid-Accent1"/>
         <w:tblW w:type="auto" w:w="0"/>
+        <w:jc w:val="center"/>
         <w:tblLook w:firstColumn="1" w:firstRow="1" w:lastColumn="0" w:lastRow="0" w:noHBand="0" w:noVBand="1" w:val="04A0"/>
       </w:tblPr>
       <w:tblGrid>
@@ -2418,9 +2359,6 @@
           </w:tcPr>
           <w:p>
             <w:r>
-              <w:rPr>
-                <w:b/>
-              </w:rPr>
               <w:t>Champ</w:t>
             </w:r>
           </w:p>
@@ -2431,9 +2369,6 @@
           </w:tcPr>
           <w:p>
             <w:r>
-              <w:rPr>
-                <w:b/>
-              </w:rPr>
               <w:t>Type</w:t>
             </w:r>
           </w:p>
@@ -2444,9 +2379,6 @@
           </w:tcPr>
           <w:p>
             <w:r>
-              <w:rPr>
-                <w:b/>
-              </w:rPr>
               <w:t>Contraintes / description</w:t>
             </w:r>
           </w:p>
@@ -2479,7 +2411,7 @@
           </w:tcPr>
           <w:p>
             <w:r>
-              <w:t>PK "SERIAL"</w:t>
+              <w:t>PK SERIAL</w:t>
             </w:r>
           </w:p>
         </w:tc>
@@ -2511,7 +2443,7 @@
           </w:tcPr>
           <w:p>
             <w:r>
-              <w:t>"NOT NULL"</w:t>
+              <w:t>NOT NULL</w:t>
             </w:r>
           </w:p>
         </w:tc>
@@ -2543,7 +2475,7 @@
           </w:tcPr>
           <w:p>
             <w:r>
-              <w:t>"DEFAULT ''"</w:t>
+              <w:t>DEFAULT empty string</w:t>
             </w:r>
           </w:p>
         </w:tc>
@@ -2575,7 +2507,7 @@
           </w:tcPr>
           <w:p>
             <w:r>
-              <w:t>"DEFAULT CURRENT_DATE"</w:t>
+              <w:t>DEFAULT CURRENT_DATE</w:t>
             </w:r>
           </w:p>
         </w:tc>
@@ -2607,7 +2539,7 @@
           </w:tcPr>
           <w:p>
             <w:r>
-              <w:t>"DEFAULT true"</w:t>
+              <w:t>DEFAULT true (migration 014)</w:t>
             </w:r>
           </w:p>
         </w:tc>
@@ -2626,6 +2558,7 @@
       <w:tblPr>
         <w:tblStyle w:val="LightGrid-Accent1"/>
         <w:tblW w:type="auto" w:w="0"/>
+        <w:jc w:val="center"/>
         <w:tblLook w:firstColumn="1" w:firstRow="1" w:lastColumn="0" w:lastRow="0" w:noHBand="0" w:noVBand="1" w:val="04A0"/>
       </w:tblPr>
       <w:tblGrid>
@@ -2640,9 +2573,6 @@
           </w:tcPr>
           <w:p>
             <w:r>
-              <w:rPr>
-                <w:b/>
-              </w:rPr>
               <w:t>Champ</w:t>
             </w:r>
           </w:p>
@@ -2653,9 +2583,6 @@
           </w:tcPr>
           <w:p>
             <w:r>
-              <w:rPr>
-                <w:b/>
-              </w:rPr>
               <w:t>Type</w:t>
             </w:r>
           </w:p>
@@ -2666,9 +2593,6 @@
           </w:tcPr>
           <w:p>
             <w:r>
-              <w:rPr>
-                <w:b/>
-              </w:rPr>
               <w:t>Contraintes / description</w:t>
             </w:r>
           </w:p>
@@ -2701,7 +2625,7 @@
           </w:tcPr>
           <w:p>
             <w:r>
-              <w:t>PK "SERIAL"</w:t>
+              <w:t>PK SERIAL</w:t>
             </w:r>
           </w:p>
         </w:tc>
@@ -2733,7 +2657,7 @@
           </w:tcPr>
           <w:p>
             <w:r>
-              <w:t>FK "NOT NULL, ON DELETE CASCADE"</w:t>
+              <w:t>FK NOT NULL, ON DELETE CASCADE</w:t>
             </w:r>
           </w:p>
         </w:tc>
@@ -2765,7 +2689,7 @@
           </w:tcPr>
           <w:p>
             <w:r>
-              <w:t>"NOT NULL"</w:t>
+              <w:t>NOT NULL</w:t>
             </w:r>
           </w:p>
         </w:tc>
@@ -2797,7 +2721,7 @@
           </w:tcPr>
           <w:p>
             <w:r>
-              <w:t>"NOT NULL, DEFAULT 'text'"</w:t>
+              <w:t>NOT NULL, DEFAULT text</w:t>
             </w:r>
           </w:p>
         </w:tc>
@@ -2829,7 +2753,7 @@
           </w:tcPr>
           <w:p>
             <w:r>
-              <w:t>"DEFAULT '[]'"</w:t>
+              <w:t>DEFAULT []</w:t>
             </w:r>
           </w:p>
         </w:tc>
@@ -2861,7 +2785,7 @@
           </w:tcPr>
           <w:p>
             <w:r>
-              <w:t>"NOT NULL, DEFAULT 0"</w:t>
+              <w:t>NOT NULL, DEFAULT 0</w:t>
             </w:r>
           </w:p>
         </w:tc>
@@ -2893,7 +2817,7 @@
           </w:tcPr>
           <w:p>
             <w:r>
-              <w:t>"identifie les KPI"</w:t>
+              <w:t>identifie les KPI</w:t>
             </w:r>
           </w:p>
         </w:tc>
@@ -2925,7 +2849,7 @@
           </w:tcPr>
           <w:p>
             <w:r>
-              <w:t>"NOT NULL, DEFAULT false"</w:t>
+              <w:t>NOT NULL, DEFAULT false</w:t>
             </w:r>
           </w:p>
         </w:tc>
@@ -2944,6 +2868,7 @@
       <w:tblPr>
         <w:tblStyle w:val="LightGrid-Accent1"/>
         <w:tblW w:type="auto" w:w="0"/>
+        <w:jc w:val="center"/>
         <w:tblLook w:firstColumn="1" w:firstRow="1" w:lastColumn="0" w:lastRow="0" w:noHBand="0" w:noVBand="1" w:val="04A0"/>
       </w:tblPr>
       <w:tblGrid>
@@ -2958,9 +2883,6 @@
           </w:tcPr>
           <w:p>
             <w:r>
-              <w:rPr>
-                <w:b/>
-              </w:rPr>
               <w:t>Champ</w:t>
             </w:r>
           </w:p>
@@ -2971,9 +2893,6 @@
           </w:tcPr>
           <w:p>
             <w:r>
-              <w:rPr>
-                <w:b/>
-              </w:rPr>
               <w:t>Type</w:t>
             </w:r>
           </w:p>
@@ -2984,9 +2903,6 @@
           </w:tcPr>
           <w:p>
             <w:r>
-              <w:rPr>
-                <w:b/>
-              </w:rPr>
               <w:t>Contraintes / description</w:t>
             </w:r>
           </w:p>
@@ -3019,7 +2935,7 @@
           </w:tcPr>
           <w:p>
             <w:r>
-              <w:t>PK "SERIAL"</w:t>
+              <w:t>PK SERIAL</w:t>
             </w:r>
           </w:p>
         </w:tc>
@@ -3051,7 +2967,7 @@
           </w:tcPr>
           <w:p>
             <w:r>
-              <w:t>FK "NOT NULL, ON DELETE CASCADE"</w:t>
+              <w:t>FK NOT NULL, ON DELETE CASCADE</w:t>
             </w:r>
           </w:p>
         </w:tc>
@@ -3083,7 +2999,7 @@
           </w:tcPr>
           <w:p>
             <w:r>
-              <w:t>FK "NOT NULL, NO ACTION"</w:t>
+              <w:t>FK NOT NULL, NO ACTION</w:t>
             </w:r>
           </w:p>
         </w:tc>
@@ -3115,7 +3031,7 @@
           </w:tcPr>
           <w:p>
             <w:r>
-              <w:t>"NOT NULL, DEFAULT '{}'"</w:t>
+              <w:t>NOT NULL, DEFAULT {}</w:t>
             </w:r>
           </w:p>
         </w:tc>
@@ -3147,7 +3063,7 @@
           </w:tcPr>
           <w:p>
             <w:r>
-              <w:t>"DEFAULT NOW()"</w:t>
+              <w:t>DEFAULT NOW()</w:t>
             </w:r>
           </w:p>
         </w:tc>
@@ -3166,6 +3082,7 @@
       <w:tblPr>
         <w:tblStyle w:val="LightGrid-Accent1"/>
         <w:tblW w:type="auto" w:w="0"/>
+        <w:jc w:val="center"/>
         <w:tblLook w:firstColumn="1" w:firstRow="1" w:lastColumn="0" w:lastRow="0" w:noHBand="0" w:noVBand="1" w:val="04A0"/>
       </w:tblPr>
       <w:tblGrid>
@@ -3180,9 +3097,6 @@
           </w:tcPr>
           <w:p>
             <w:r>
-              <w:rPr>
-                <w:b/>
-              </w:rPr>
               <w:t>Champ</w:t>
             </w:r>
           </w:p>
@@ -3193,9 +3107,6 @@
           </w:tcPr>
           <w:p>
             <w:r>
-              <w:rPr>
-                <w:b/>
-              </w:rPr>
               <w:t>Type</w:t>
             </w:r>
           </w:p>
@@ -3206,9 +3117,6 @@
           </w:tcPr>
           <w:p>
             <w:r>
-              <w:rPr>
-                <w:b/>
-              </w:rPr>
               <w:t>Contraintes / description</w:t>
             </w:r>
           </w:p>
@@ -3241,7 +3149,7 @@
           </w:tcPr>
           <w:p>
             <w:r>
-              <w:t>PK "SERIAL"</w:t>
+              <w:t>PK SERIAL</w:t>
             </w:r>
           </w:p>
         </w:tc>
@@ -3273,7 +3181,7 @@
           </w:tcPr>
           <w:p>
             <w:r>
-              <w:t>"NOT NULL"</w:t>
+              <w:t>NOT NULL</w:t>
             </w:r>
           </w:p>
         </w:tc>
@@ -3305,7 +3213,7 @@
           </w:tcPr>
           <w:p>
             <w:r>
-              <w:t>"NULL"</w:t>
+              <w:t>NULL</w:t>
             </w:r>
           </w:p>
         </w:tc>
@@ -3337,7 +3245,7 @@
           </w:tcPr>
           <w:p>
             <w:r>
-              <w:t>"DEFAULT 0"</w:t>
+              <w:t>DEFAULT 0</w:t>
             </w:r>
           </w:p>
         </w:tc>
@@ -3369,7 +3277,7 @@
           </w:tcPr>
           <w:p>
             <w:r>
-              <w:t>"DEFAULT NOW()"</w:t>
+              <w:t>DEFAULT NOW()</w:t>
             </w:r>
           </w:p>
         </w:tc>
@@ -3401,7 +3309,7 @@
           </w:tcPr>
           <w:p>
             <w:r>
-              <w:t>"admin:nom | alumni:id | system"</w:t>
+              <w:t>admin:nom | alumni:id | system</w:t>
             </w:r>
           </w:p>
         </w:tc>
@@ -3420,6 +3328,7 @@
       <w:tblPr>
         <w:tblStyle w:val="LightGrid-Accent1"/>
         <w:tblW w:type="auto" w:w="0"/>
+        <w:jc w:val="center"/>
         <w:tblLook w:firstColumn="1" w:firstRow="1" w:lastColumn="0" w:lastRow="0" w:noHBand="0" w:noVBand="1" w:val="04A0"/>
       </w:tblPr>
       <w:tblGrid>
@@ -3434,9 +3343,6 @@
           </w:tcPr>
           <w:p>
             <w:r>
-              <w:rPr>
-                <w:b/>
-              </w:rPr>
               <w:t>Champ</w:t>
             </w:r>
           </w:p>
@@ -3447,9 +3353,6 @@
           </w:tcPr>
           <w:p>
             <w:r>
-              <w:rPr>
-                <w:b/>
-              </w:rPr>
               <w:t>Type</w:t>
             </w:r>
           </w:p>
@@ -3460,9 +3363,6 @@
           </w:tcPr>
           <w:p>
             <w:r>
-              <w:rPr>
-                <w:b/>
-              </w:rPr>
               <w:t>Contraintes / description</w:t>
             </w:r>
           </w:p>
@@ -3495,7 +3395,7 @@
           </w:tcPr>
           <w:p>
             <w:r>
-              <w:t>PK "SERIAL"</w:t>
+              <w:t>PK SERIAL</w:t>
             </w:r>
           </w:p>
         </w:tc>
@@ -3527,7 +3427,7 @@
           </w:tcPr>
           <w:p>
             <w:r>
-              <w:t>FK "ON DELETE SET NULL (snapshot conserve)"</w:t>
+              <w:t>FK ON DELETE SET NULL (snapshot conserve)</w:t>
             </w:r>
           </w:p>
         </w:tc>
@@ -3559,7 +3459,7 @@
           </w:tcPr>
           <w:p>
             <w:r>
-              <w:t>"NOT NULL, export | suppression"</w:t>
+              <w:t>NOT NULL, export | suppression</w:t>
             </w:r>
           </w:p>
         </w:tc>
@@ -3591,7 +3491,7 @@
           </w:tcPr>
           <w:p>
             <w:r>
-              <w:t>NOT NULL, DEFAULT 'envoyee' — cycle : envoyee / en_traitement / traitee / rejetee</w:t>
+              <w:t>NOT NULL, DEFAULT envoyee; cycle: envoyee/en_traitement/traitee/rejetee</w:t>
             </w:r>
           </w:p>
         </w:tc>
@@ -3623,7 +3523,7 @@
           </w:tcPr>
           <w:p>
             <w:r>
-              <w:t>"NOT NULL, DEFAULT NOW()"</w:t>
+              <w:t>NOT NULL, DEFAULT NOW()</w:t>
             </w:r>
           </w:p>
         </w:tc>
@@ -3655,7 +3555,7 @@
           </w:tcPr>
           <w:p>
             <w:r>
-              <w:t>"NULL"</w:t>
+              <w:t>NULL</w:t>
             </w:r>
           </w:p>
         </w:tc>
@@ -3687,7 +3587,7 @@
           </w:tcPr>
           <w:p>
             <w:r>
-              <w:t>"NULL"</w:t>
+              <w:t>NULL</w:t>
             </w:r>
           </w:p>
         </w:tc>
@@ -3719,7 +3619,7 @@
           </w:tcPr>
           <w:p>
             <w:r>
-              <w:t>"NULL"</w:t>
+              <w:t>NULL</w:t>
             </w:r>
           </w:p>
         </w:tc>
@@ -3751,7 +3651,7 @@
           </w:tcPr>
           <w:p>
             <w:r>
-              <w:t>"snapshot au moment de la demande"</w:t>
+              <w:t>snapshot au moment de la demande</w:t>
             </w:r>
           </w:p>
         </w:tc>
@@ -3783,7 +3683,7 @@
           </w:tcPr>
           <w:p>
             <w:r>
-              <w:t>"snapshot au moment de la demande"</w:t>
+              <w:t>snapshot au moment de la demande</w:t>
             </w:r>
           </w:p>
         </w:tc>
@@ -3815,7 +3715,7 @@
           </w:tcPr>
           <w:p>
             <w:r>
-              <w:t>NULL, nom de l'admin ayant pris la demande en charge (verrou anti-traitement parallèle)</w:t>
+              <w:t>NULL, admin ayant verrouille la demande</w:t>
             </w:r>
           </w:p>
         </w:tc>
@@ -3847,7 +3747,7 @@
           </w:tcPr>
           <w:p>
             <w:r>
-              <w:t>NULL, date/heure de prise en charge par un administrateur</w:t>
+              <w:t>NULL, date/heure de prise en charge admin</w:t>
             </w:r>
           </w:p>
         </w:tc>
@@ -3866,6 +3766,7 @@
       <w:tblPr>
         <w:tblStyle w:val="LightGrid-Accent1"/>
         <w:tblW w:type="auto" w:w="0"/>
+        <w:jc w:val="center"/>
         <w:tblLook w:firstColumn="1" w:firstRow="1" w:lastColumn="0" w:lastRow="0" w:noHBand="0" w:noVBand="1" w:val="04A0"/>
       </w:tblPr>
       <w:tblGrid>
@@ -3880,9 +3781,6 @@
           </w:tcPr>
           <w:p>
             <w:r>
-              <w:rPr>
-                <w:b/>
-              </w:rPr>
               <w:t>Champ</w:t>
             </w:r>
           </w:p>
@@ -3893,9 +3791,6 @@
           </w:tcPr>
           <w:p>
             <w:r>
-              <w:rPr>
-                <w:b/>
-              </w:rPr>
               <w:t>Type</w:t>
             </w:r>
           </w:p>
@@ -3906,9 +3801,6 @@
           </w:tcPr>
           <w:p>
             <w:r>
-              <w:rPr>
-                <w:b/>
-              </w:rPr>
               <w:t>Contraintes / description</w:t>
             </w:r>
           </w:p>
@@ -3941,7 +3833,7 @@
           </w:tcPr>
           <w:p>
             <w:r>
-              <w:t>PK "SERIAL, stockage auth OTP"</w:t>
+              <w:t>PK SERIAL, stockage auth OTP</w:t>
             </w:r>
           </w:p>
         </w:tc>
@@ -3973,7 +3865,7 @@
           </w:tcPr>
           <w:p>
             <w:r>
-              <w:t>"NOT NULL"</w:t>
+              <w:t>NOT NULL</w:t>
             </w:r>
           </w:p>
         </w:tc>
@@ -4005,7 +3897,7 @@
           </w:tcPr>
           <w:p>
             <w:r>
-              <w:t>"NOT NULL"</w:t>
+              <w:t>NOT NULL</w:t>
             </w:r>
           </w:p>
         </w:tc>
@@ -4037,7 +3929,7 @@
           </w:tcPr>
           <w:p>
             <w:r>
-              <w:t>"DEFAULT 0"</w:t>
+              <w:t>DEFAULT 0</w:t>
             </w:r>
           </w:p>
         </w:tc>
@@ -4069,7 +3961,7 @@
           </w:tcPr>
           <w:p>
             <w:r>
-              <w:t>"DEFAULT NOW()"</w:t>
+              <w:t>DEFAULT NOW()</w:t>
             </w:r>
           </w:p>
         </w:tc>
@@ -4101,7 +3993,7 @@
           </w:tcPr>
           <w:p>
             <w:r>
-              <w:t>"NOT NULL, TTL 10 min"</w:t>
+              <w:t>NOT NULL, TTL 10 min</w:t>
             </w:r>
           </w:p>
         </w:tc>
@@ -4133,7 +4025,7 @@
           </w:tcPr>
           <w:p>
             <w:r>
-              <w:t>"DEFAULT false"</w:t>
+              <w:t>DEFAULT false</w:t>
             </w:r>
           </w:p>
         </w:tc>
@@ -4165,7 +4057,7 @@
           </w:tcPr>
           <w:p>
             <w:r>
-              <w:t>"DEFAULT ''"</w:t>
+              <w:t>DEFAULT empty string</w:t>
             </w:r>
           </w:p>
         </w:tc>
@@ -4184,6 +4076,7 @@
       <w:tblPr>
         <w:tblStyle w:val="LightGrid-Accent1"/>
         <w:tblW w:type="auto" w:w="0"/>
+        <w:jc w:val="center"/>
         <w:tblLook w:firstColumn="1" w:firstRow="1" w:lastColumn="0" w:lastRow="0" w:noHBand="0" w:noVBand="1" w:val="04A0"/>
       </w:tblPr>
       <w:tblGrid>
@@ -4198,9 +4091,6 @@
           </w:tcPr>
           <w:p>
             <w:r>
-              <w:rPr>
-                <w:b/>
-              </w:rPr>
               <w:t>Champ</w:t>
             </w:r>
           </w:p>
@@ -4211,9 +4101,6 @@
           </w:tcPr>
           <w:p>
             <w:r>
-              <w:rPr>
-                <w:b/>
-              </w:rPr>
               <w:t>Type</w:t>
             </w:r>
           </w:p>
@@ -4224,9 +4111,6 @@
           </w:tcPr>
           <w:p>
             <w:r>
-              <w:rPr>
-                <w:b/>
-              </w:rPr>
               <w:t>Contraintes / description</w:t>
             </w:r>
           </w:p>
@@ -4259,7 +4143,7 @@
           </w:tcPr>
           <w:p>
             <w:r>
-              <w:t>PK "tracking des migrations"</w:t>
+              <w:t>PK tracking des migrations</w:t>
             </w:r>
           </w:p>
         </w:tc>
@@ -4291,7 +4175,7 @@
           </w:tcPr>
           <w:p>
             <w:r>
-              <w:t>"NOT NULL, DEFAULT NOW()"</w:t>
+              <w:t>NOT NULL, DEFAULT NOW()</w:t>
             </w:r>
           </w:p>
         </w:tc>
@@ -4299,7 +4183,6 @@
     </w:tbl>
     <w:p/>
     <w:sectPr>
-      <w:headerReference w:type="default" r:id="rId9"/>
       <w:pgSz w:w="12240" w:h="15840"/>
       <w:pgMar w:top="1440" w:right="1800" w:bottom="1440" w:left="1800" w:header="720" w:footer="720" w:gutter="0"/>
       <w:cols w:space="720"/>
@@ -4307,23 +4190,6 @@
     </w:sectPr>
   </w:body>
 </w:document>
-</file>
-
-<file path=word/header1.xml><?xml version="1.0" encoding="utf-8"?>
-<w:hdr xmlns:m="http://schemas.openxmlformats.org/officeDocument/2006/math" xmlns:mc="http://schemas.openxmlformats.org/markup-compatibility/2006" xmlns:mo="http://schemas.microsoft.com/office/mac/office/2008/main" xmlns:mv="urn:schemas-microsoft-com:mac:vml" xmlns:o="urn:schemas-microsoft-com:office:office" xmlns:r="http://schemas.openxmlformats.org/officeDocument/2006/relationships" xmlns:v="urn:schemas-microsoft-com:vml" xmlns:w10="urn:schemas-microsoft-com:office:word" xmlns:w14="http://schemas.microsoft.com/office/word/2010/wordml" xmlns:w="http://schemas.openxmlformats.org/wordprocessingml/2006/main" xmlns:wne="http://schemas.microsoft.com/office/word/2006/wordml" xmlns:wp14="http://schemas.microsoft.com/office/word/2010/wordprocessingDrawing" xmlns:wp="http://schemas.openxmlformats.org/drawingml/2006/wordprocessingDrawing" xmlns:wpc="http://schemas.microsoft.com/office/word/2010/wordprocessingCanvas" xmlns:wpg="http://schemas.microsoft.com/office/word/2010/wordprocessingGroup" xmlns:wpi="http://schemas.microsoft.com/office/word/2010/wordprocessingInk" xmlns:wps="http://schemas.microsoft.com/office/word/2010/wordprocessingShape" mc:Ignorable="w14 wp14">
-  <w:p>
-    <w:pPr>
-      <w:pStyle w:val="Header"/>
-    </w:pPr>
-    <w:r>
-      <w:rPr>
-        <w:color w:val="808080"/>
-        <w:sz w:val="18"/>
-      </w:rPr>
-      <w:t>Annexe — Modèle de Données CRM Alumni</w:t>
-    </w:r>
-  </w:p>
-</w:hdr>
 </file>
 
 <file path=word/numbering.xml><?xml version="1.0" encoding="utf-8"?>
@@ -4691,7 +4557,7 @@
     <w:rsid w:val="00FC693F"/>
     <w:rPr>
       <w:rFonts w:ascii="Calibri" w:hAnsi="Calibri"/>
-      <w:sz w:val="22"/>
+      <w:sz w:val="18"/>
     </w:rPr>
   </w:style>
   <w:style w:type="paragraph" w:styleId="Header">

</xml_diff>